<commit_message>
vault backup: 2026-02-23 16:27:33
</commit_message>
<xml_diff>
--- a/Materias/Diseño de sistemas/Material/TP1/Flujos de sucesos/CU10 - Aprobar servicio/CU - Aprobar servicio.docx
+++ b/Materias/Diseño de sistemas/Material/TP1/Flujos de sucesos/CU10 - Aprobar servicio/CU - Aprobar servicio.docx
@@ -1879,26 +1879,12 @@
                 <w:insideV w:val="single" w:sz="18" w:space="0" w:color="FF0000"/>
               </w:tblBorders>
               <w:tblLayout w:type="fixed"/>
-              <w:tblCellMar>
-                <w:top w:w="0" w:type="dxa"/>
-                <w:left w:w="0" w:type="dxa"/>
-                <w:bottom w:w="0" w:type="dxa"/>
-                <w:right w:w="0" w:type="dxa"/>
-              </w:tblCellMar>
               <w:tblLook w:val="0600" w:firstRow="0" w:lastRow="0" w:firstColumn="0" w:lastColumn="0" w:noHBand="1" w:noVBand="1"/>
             </w:tblPr>
             <w:tblGrid>
               <w:gridCol w:w="5455"/>
             </w:tblGrid>
             <w:tr>
-              <w:tblPrEx>
-                <w:tblCellMar>
-                  <w:top w:w="0" w:type="dxa"/>
-                  <w:left w:w="0" w:type="dxa"/>
-                  <w:bottom w:w="0" w:type="dxa"/>
-                  <w:right w:w="0" w:type="dxa"/>
-                </w:tblCellMar>
-              </w:tblPrEx>
               <w:tc>
                 <w:tcPr>
                   <w:tcW w:w="5455" w:type="dxa"/>
@@ -2044,26 +2030,12 @@
                           <w:insideV w:val="single" w:sz="18" w:space="0" w:color="FF780A"/>
                         </w:tblBorders>
                         <w:tblLayout w:type="fixed"/>
-                        <w:tblCellMar>
-                          <w:top w:w="0" w:type="dxa"/>
-                          <w:left w:w="0" w:type="dxa"/>
-                          <w:bottom w:w="0" w:type="dxa"/>
-                          <w:right w:w="0" w:type="dxa"/>
-                        </w:tblCellMar>
                         <w:tblLook w:val="0600" w:firstRow="0" w:lastRow="0" w:firstColumn="0" w:lastColumn="0" w:noHBand="1" w:noVBand="1"/>
                       </w:tblPr>
                       <w:tblGrid>
                         <w:gridCol w:w="5255"/>
                       </w:tblGrid>
                       <w:tr>
-                        <w:tblPrEx>
-                          <w:tblCellMar>
-                            <w:top w:w="0" w:type="dxa"/>
-                            <w:left w:w="0" w:type="dxa"/>
-                            <w:bottom w:w="0" w:type="dxa"/>
-                            <w:right w:w="0" w:type="dxa"/>
-                          </w:tblCellMar>
-                        </w:tblPrEx>
                         <w:tc>
                           <w:tcPr>
                             <w:tcW w:w="5255" w:type="dxa"/>
@@ -2222,26 +2194,12 @@
                                     <w:insideV w:val="single" w:sz="18" w:space="0" w:color="FFCC00"/>
                                   </w:tblBorders>
                                   <w:tblLayout w:type="fixed"/>
-                                  <w:tblCellMar>
-                                    <w:top w:w="0" w:type="dxa"/>
-                                    <w:left w:w="0" w:type="dxa"/>
-                                    <w:bottom w:w="0" w:type="dxa"/>
-                                    <w:right w:w="0" w:type="dxa"/>
-                                  </w:tblCellMar>
                                   <w:tblLook w:val="0600" w:firstRow="0" w:lastRow="0" w:firstColumn="0" w:lastColumn="0" w:noHBand="1" w:noVBand="1"/>
                                 </w:tblPr>
                                 <w:tblGrid>
                                   <w:gridCol w:w="5055"/>
                                 </w:tblGrid>
                                 <w:tr>
-                                  <w:tblPrEx>
-                                    <w:tblCellMar>
-                                      <w:top w:w="0" w:type="dxa"/>
-                                      <w:left w:w="0" w:type="dxa"/>
-                                      <w:bottom w:w="0" w:type="dxa"/>
-                                      <w:right w:w="0" w:type="dxa"/>
-                                    </w:tblCellMar>
-                                  </w:tblPrEx>
                                   <w:tc>
                                     <w:tcPr>
                                       <w:tcW w:w="5055" w:type="dxa"/>
@@ -3136,26 +3094,12 @@
                 <w:insideV w:val="single" w:sz="18" w:space="0" w:color="FF0000"/>
               </w:tblBorders>
               <w:tblLayout w:type="fixed"/>
-              <w:tblCellMar>
-                <w:top w:w="0" w:type="dxa"/>
-                <w:left w:w="0" w:type="dxa"/>
-                <w:bottom w:w="0" w:type="dxa"/>
-                <w:right w:w="0" w:type="dxa"/>
-              </w:tblCellMar>
               <w:tblLook w:val="0600" w:firstRow="0" w:lastRow="0" w:firstColumn="0" w:lastColumn="0" w:noHBand="1" w:noVBand="1"/>
             </w:tblPr>
             <w:tblGrid>
               <w:gridCol w:w="5455"/>
             </w:tblGrid>
             <w:tr>
-              <w:tblPrEx>
-                <w:tblCellMar>
-                  <w:top w:w="0" w:type="dxa"/>
-                  <w:left w:w="0" w:type="dxa"/>
-                  <w:bottom w:w="0" w:type="dxa"/>
-                  <w:right w:w="0" w:type="dxa"/>
-                </w:tblCellMar>
-              </w:tblPrEx>
               <w:tc>
                 <w:tcPr>
                   <w:tcW w:w="5455" w:type="dxa"/>
@@ -9412,9 +9356,7 @@
       <w:tblStyleRowBandSize w:val="1"/>
       <w:tblStyleColBandSize w:val="1"/>
       <w:tblCellMar>
-        <w:top w:w="0" w:type="dxa"/>
         <w:left w:w="108" w:type="dxa"/>
-        <w:bottom w:w="0" w:type="dxa"/>
         <w:right w:w="108" w:type="dxa"/>
       </w:tblCellMar>
     </w:tblPr>
@@ -9428,9 +9370,7 @@
       <w:tblStyleRowBandSize w:val="1"/>
       <w:tblStyleColBandSize w:val="1"/>
       <w:tblCellMar>
-        <w:top w:w="0" w:type="dxa"/>
         <w:left w:w="108" w:type="dxa"/>
-        <w:bottom w:w="0" w:type="dxa"/>
         <w:right w:w="108" w:type="dxa"/>
       </w:tblCellMar>
     </w:tblPr>
@@ -9444,9 +9384,7 @@
       <w:tblStyleRowBandSize w:val="1"/>
       <w:tblStyleColBandSize w:val="1"/>
       <w:tblCellMar>
-        <w:top w:w="0" w:type="dxa"/>
         <w:left w:w="108" w:type="dxa"/>
-        <w:bottom w:w="0" w:type="dxa"/>
         <w:right w:w="108" w:type="dxa"/>
       </w:tblCellMar>
     </w:tblPr>
@@ -9460,9 +9398,7 @@
       <w:tblStyleRowBandSize w:val="1"/>
       <w:tblStyleColBandSize w:val="1"/>
       <w:tblCellMar>
-        <w:top w:w="0" w:type="dxa"/>
         <w:left w:w="108" w:type="dxa"/>
-        <w:bottom w:w="0" w:type="dxa"/>
         <w:right w:w="108" w:type="dxa"/>
       </w:tblCellMar>
     </w:tblPr>
@@ -9472,12 +9408,6 @@
     <w:tblPr>
       <w:tblStyleRowBandSize w:val="1"/>
       <w:tblStyleColBandSize w:val="1"/>
-      <w:tblCellMar>
-        <w:top w:w="0" w:type="dxa"/>
-        <w:left w:w="0" w:type="dxa"/>
-        <w:bottom w:w="0" w:type="dxa"/>
-        <w:right w:w="0" w:type="dxa"/>
-      </w:tblCellMar>
     </w:tblPr>
   </w:style>
   <w:style w:type="table" w:customStyle="1" w:styleId="a4">
@@ -9485,12 +9415,6 @@
     <w:tblPr>
       <w:tblStyleRowBandSize w:val="1"/>
       <w:tblStyleColBandSize w:val="1"/>
-      <w:tblCellMar>
-        <w:top w:w="0" w:type="dxa"/>
-        <w:left w:w="0" w:type="dxa"/>
-        <w:bottom w:w="0" w:type="dxa"/>
-        <w:right w:w="0" w:type="dxa"/>
-      </w:tblCellMar>
     </w:tblPr>
   </w:style>
   <w:style w:type="table" w:customStyle="1" w:styleId="a5">
@@ -9498,12 +9422,6 @@
     <w:tblPr>
       <w:tblStyleRowBandSize w:val="1"/>
       <w:tblStyleColBandSize w:val="1"/>
-      <w:tblCellMar>
-        <w:top w:w="0" w:type="dxa"/>
-        <w:left w:w="0" w:type="dxa"/>
-        <w:bottom w:w="0" w:type="dxa"/>
-        <w:right w:w="0" w:type="dxa"/>
-      </w:tblCellMar>
     </w:tblPr>
   </w:style>
   <w:style w:type="table" w:customStyle="1" w:styleId="a6">
@@ -9511,12 +9429,6 @@
     <w:tblPr>
       <w:tblStyleRowBandSize w:val="1"/>
       <w:tblStyleColBandSize w:val="1"/>
-      <w:tblCellMar>
-        <w:top w:w="0" w:type="dxa"/>
-        <w:left w:w="0" w:type="dxa"/>
-        <w:bottom w:w="0" w:type="dxa"/>
-        <w:right w:w="0" w:type="dxa"/>
-      </w:tblCellMar>
     </w:tblPr>
   </w:style>
   <w:style w:type="table" w:customStyle="1" w:styleId="a7">
@@ -9528,9 +9440,7 @@
       <w:tblStyleRowBandSize w:val="1"/>
       <w:tblStyleColBandSize w:val="1"/>
       <w:tblCellMar>
-        <w:top w:w="0" w:type="dxa"/>
         <w:left w:w="108" w:type="dxa"/>
-        <w:bottom w:w="0" w:type="dxa"/>
         <w:right w:w="108" w:type="dxa"/>
       </w:tblCellMar>
     </w:tblPr>
@@ -9544,9 +9454,7 @@
       <w:tblStyleRowBandSize w:val="1"/>
       <w:tblStyleColBandSize w:val="1"/>
       <w:tblCellMar>
-        <w:top w:w="0" w:type="dxa"/>
         <w:left w:w="108" w:type="dxa"/>
-        <w:bottom w:w="0" w:type="dxa"/>
         <w:right w:w="108" w:type="dxa"/>
       </w:tblCellMar>
     </w:tblPr>
@@ -9560,9 +9468,7 @@
       <w:tblStyleRowBandSize w:val="1"/>
       <w:tblStyleColBandSize w:val="1"/>
       <w:tblCellMar>
-        <w:top w:w="0" w:type="dxa"/>
         <w:left w:w="108" w:type="dxa"/>
-        <w:bottom w:w="0" w:type="dxa"/>
         <w:right w:w="108" w:type="dxa"/>
       </w:tblCellMar>
     </w:tblPr>
@@ -9576,9 +9482,7 @@
       <w:tblStyleRowBandSize w:val="1"/>
       <w:tblStyleColBandSize w:val="1"/>
       <w:tblCellMar>
-        <w:top w:w="0" w:type="dxa"/>
         <w:left w:w="108" w:type="dxa"/>
-        <w:bottom w:w="0" w:type="dxa"/>
         <w:right w:w="108" w:type="dxa"/>
       </w:tblCellMar>
     </w:tblPr>
@@ -9592,9 +9496,7 @@
       <w:tblStyleRowBandSize w:val="1"/>
       <w:tblStyleColBandSize w:val="1"/>
       <w:tblCellMar>
-        <w:top w:w="0" w:type="dxa"/>
         <w:left w:w="108" w:type="dxa"/>
-        <w:bottom w:w="0" w:type="dxa"/>
         <w:right w:w="108" w:type="dxa"/>
       </w:tblCellMar>
     </w:tblPr>

</xml_diff>

<commit_message>
vault backup: 2026-02-25 17:41:30
</commit_message>
<xml_diff>
--- a/Materias/Diseño de sistemas/Material/TP1/Flujos de sucesos/CU10 - Aprobar servicio/CU - Aprobar servicio.docx
+++ b/Materias/Diseño de sistemas/Material/TP1/Flujos de sucesos/CU10 - Aprobar servicio/CU - Aprobar servicio.docx
@@ -669,6 +669,7 @@
                 <w:b/>
                 <w:bCs/>
               </w:rPr>
+              <w:lastRenderedPageBreak/>
               <w:t>Si el cliente desaprueba el servicio</w:t>
             </w:r>
           </w:p>
@@ -766,6 +767,7 @@
               <w:spacing w:line="276" w:lineRule="auto"/>
             </w:pPr>
             <w:r>
+              <w:lastRenderedPageBreak/>
               <w:t>Estado Final</w:t>
             </w:r>
           </w:p>
@@ -795,7 +797,6 @@
               <w:spacing w:line="276" w:lineRule="auto"/>
             </w:pPr>
             <w:r>
-              <w:lastRenderedPageBreak/>
               <w:t xml:space="preserve">Instancia de </w:t>
             </w:r>
             <w:proofErr w:type="spellStart"/>
@@ -1342,6 +1343,7 @@
               <w:spacing w:line="276" w:lineRule="auto"/>
             </w:pPr>
             <w:r>
+              <w:lastRenderedPageBreak/>
               <w:t xml:space="preserve">con relación a instancia de </w:t>
             </w:r>
             <w:proofErr w:type="spellStart"/>
@@ -1656,7 +1658,6 @@
               <w:spacing w:line="276" w:lineRule="auto"/>
             </w:pPr>
             <w:r>
-              <w:lastRenderedPageBreak/>
               <w:t xml:space="preserve">  2.1. Buscar instancia de </w:t>
             </w:r>
             <w:proofErr w:type="spellStart"/>
@@ -2306,7 +2307,6 @@
                                               <w:i/>
                                               <w:iCs/>
                                             </w:rPr>
-                                            <w:lastRenderedPageBreak/>
                                             <w:t>nombreProyecto</w:t>
                                           </w:r>
                                           <w:r>
@@ -2871,6 +2871,7 @@
               <w:spacing w:line="276" w:lineRule="auto"/>
             </w:pPr>
             <w:r>
+              <w:lastRenderedPageBreak/>
               <w:t xml:space="preserve">  4.4. Leer instancia de </w:t>
             </w:r>
             <w:r>
@@ -4731,7 +4732,6 @@
                   <w:spacing w:line="276" w:lineRule="auto"/>
                 </w:pPr>
                 <w:r>
-                  <w:lastRenderedPageBreak/>
                   <w:t xml:space="preserve">con relación a instancia de </w:t>
                 </w:r>
                 <w:r>
@@ -5556,7 +5556,6 @@
           <w:bCs/>
           <w:noProof/>
         </w:rPr>
-        <w:lastRenderedPageBreak/>
         <w:drawing>
           <wp:inline distT="114300" distB="114300" distL="114300" distR="114300" wp14:anchorId="75E6E4D8" wp14:editId="75E6E4D9">
             <wp:extent cx="4074478" cy="3214930"/>
@@ -5727,7 +5726,6 @@
           <w:bCs/>
           <w:noProof/>
         </w:rPr>
-        <w:lastRenderedPageBreak/>
         <w:drawing>
           <wp:inline distT="114300" distB="114300" distL="114300" distR="114300" wp14:anchorId="75E6E4DC" wp14:editId="75E6E4DD">
             <wp:extent cx="3939325" cy="1826785"/>

</xml_diff>